<commit_message>
chore: regenerated artifacts + closed-loop CSV compat + webapp env
- data/base/paysim_sample.csv: regenerated with 30K rows for richer training
- data/models/xgb.json + lgb.txt: trained model artifacts (committed for
  reproducibility — repo clones work out-of-the-box)
- results/defend_summary.json: live metrics from this run
- results/generate_summary.json + fidelity/: per-attack fidelity reports
- docs/Solution_Walkthrough.docx: regenerated with live metrics
- closed_loop/pipeline.py: switched parquet → CSV (pyarrow not installed
  in some envs; CSV is portable and sufficient for the demo)
- webapp/next-env.d.ts + package-lock.json: auto-generated by Next.js
</commit_message>
<xml_diff>
--- a/docs/Solution_Walkthrough.docx
+++ b/docs/Solution_Walkthrough.docx
@@ -986,14 +986,6 @@
         <w:t>Efficacy on held-out test set</w:t>
       </w:r>
     </w:p>
-    <w:p>
-      <w:r>
-        <w:rPr>
-          <w:rFonts w:ascii="Inter" w:hAnsi="Inter"/>
-        </w:rPr>
-        <w:t>(Live metrics available after running `make demo`. Documented benchmark numbers in webapp leaderboard.)</w:t>
-      </w:r>
-    </w:p>
     <w:tbl>
       <w:tblPr>
         <w:tblStyle w:val="LightGrid-Accent1"/>
@@ -1129,7 +1121,7 @@
               <w:rPr>
                 <w:sz w:val="20"/>
               </w:rPr>
-              <w:t>0.931</w:t>
+              <w:t>0.5810</w:t>
             </w:r>
           </w:p>
         </w:tc>
@@ -1142,7 +1134,7 @@
               <w:rPr>
                 <w:sz w:val="20"/>
               </w:rPr>
-              <w:t>0.842</w:t>
+              <w:t>0.1005</w:t>
             </w:r>
           </w:p>
         </w:tc>
@@ -1155,7 +1147,7 @@
               <w:rPr>
                 <w:sz w:val="20"/>
               </w:rPr>
-              <w:t>0.871</w:t>
+              <w:t>0.0816</w:t>
             </w:r>
           </w:p>
         </w:tc>
@@ -1168,7 +1160,7 @@
               <w:rPr>
                 <w:sz w:val="20"/>
               </w:rPr>
-              <w:t>0.815</w:t>
+              <w:t>0.1307</w:t>
             </w:r>
           </w:p>
         </w:tc>
@@ -1181,7 +1173,7 @@
               <w:rPr>
                 <w:sz w:val="20"/>
               </w:rPr>
-              <w:t>0.024</w:t>
+              <w:t>0.0647</w:t>
             </w:r>
           </w:p>
         </w:tc>
@@ -1209,7 +1201,7 @@
               <w:rPr>
                 <w:sz w:val="20"/>
               </w:rPr>
-              <w:t>0.928</w:t>
+              <w:t>0.5562</w:t>
             </w:r>
           </w:p>
         </w:tc>
@@ -1222,7 +1214,7 @@
               <w:rPr>
                 <w:sz w:val="20"/>
               </w:rPr>
-              <w:t>0.839</w:t>
+              <w:t>0.0950</w:t>
             </w:r>
           </w:p>
         </w:tc>
@@ -1235,7 +1227,7 @@
               <w:rPr>
                 <w:sz w:val="20"/>
               </w:rPr>
-              <w:t>0.866</w:t>
+              <w:t>0.0695</w:t>
             </w:r>
           </w:p>
         </w:tc>
@@ -1248,7 +1240,7 @@
               <w:rPr>
                 <w:sz w:val="20"/>
               </w:rPr>
-              <w:t>0.814</w:t>
+              <w:t>0.1503</w:t>
             </w:r>
           </w:p>
         </w:tc>
@@ -1261,7 +1253,7 @@
               <w:rPr>
                 <w:sz w:val="20"/>
               </w:rPr>
-              <w:t>0.025</w:t>
+              <w:t>0.0886</w:t>
             </w:r>
           </w:p>
         </w:tc>
@@ -1289,7 +1281,7 @@
               <w:rPr>
                 <w:sz w:val="20"/>
               </w:rPr>
-              <w:t>0.918</w:t>
+              <w:t>0.5393</w:t>
             </w:r>
           </w:p>
         </w:tc>
@@ -1302,7 +1294,7 @@
               <w:rPr>
                 <w:sz w:val="20"/>
               </w:rPr>
-              <w:t>0.821</w:t>
+              <w:t>0.1301</w:t>
             </w:r>
           </w:p>
         </w:tc>
@@ -1315,7 +1307,7 @@
               <w:rPr>
                 <w:sz w:val="20"/>
               </w:rPr>
-              <w:t>0.853</w:t>
+              <w:t>0.1720</w:t>
             </w:r>
           </w:p>
         </w:tc>
@@ -1328,7 +1320,7 @@
               <w:rPr>
                 <w:sz w:val="20"/>
               </w:rPr>
-              <w:t>0.792</w:t>
+              <w:t>0.1046</w:t>
             </w:r>
           </w:p>
         </w:tc>
@@ -1341,7 +1333,7 @@
               <w:rPr>
                 <w:sz w:val="20"/>
               </w:rPr>
-              <w:t>0.029</w:t>
+              <w:t>0.0221</w:t>
             </w:r>
           </w:p>
         </w:tc>
@@ -1369,7 +1361,7 @@
               <w:rPr>
                 <w:sz w:val="20"/>
               </w:rPr>
-              <w:t>0.892</w:t>
+              <w:t>0.5903</w:t>
             </w:r>
           </w:p>
         </w:tc>
@@ -1382,7 +1374,7 @@
               <w:rPr>
                 <w:sz w:val="20"/>
               </w:rPr>
-              <w:t>0.794</w:t>
+              <w:t>0.1199</w:t>
             </w:r>
           </w:p>
         </w:tc>
@@ -1395,7 +1387,7 @@
               <w:rPr>
                 <w:sz w:val="20"/>
               </w:rPr>
-              <w:t>0.831</w:t>
+              <w:t>0.0852</w:t>
             </w:r>
           </w:p>
         </w:tc>
@@ -1408,7 +1400,7 @@
               <w:rPr>
                 <w:sz w:val="20"/>
               </w:rPr>
-              <w:t>0.760</w:t>
+              <w:t>0.2026</w:t>
             </w:r>
           </w:p>
         </w:tc>
@@ -1421,167 +1413,7 @@
               <w:rPr>
                 <w:sz w:val="20"/>
               </w:rPr>
-              <w:t>0.034</w:t>
-            </w:r>
-          </w:p>
-        </w:tc>
-      </w:tr>
-      <w:tr>
-        <w:tc>
-          <w:tcPr>
-            <w:tcW w:type="dxa" w:w="1440"/>
-          </w:tcPr>
-          <w:p>
-            <w:r>
-              <w:rPr>
-                <w:sz w:val="20"/>
-              </w:rPr>
-              <w:t>llm_judge (narrative)</w:t>
-            </w:r>
-          </w:p>
-        </w:tc>
-        <w:tc>
-          <w:tcPr>
-            <w:tcW w:type="dxa" w:w="1440"/>
-          </w:tcPr>
-          <w:p>
-            <w:r>
-              <w:rPr>
-                <w:sz w:val="20"/>
-              </w:rPr>
-              <w:t>0.876</w:t>
-            </w:r>
-          </w:p>
-        </w:tc>
-        <w:tc>
-          <w:tcPr>
-            <w:tcW w:type="dxa" w:w="1440"/>
-          </w:tcPr>
-          <w:p>
-            <w:r>
-              <w:rPr>
-                <w:sz w:val="20"/>
-              </w:rPr>
-              <w:t>0.782</w:t>
-            </w:r>
-          </w:p>
-        </w:tc>
-        <w:tc>
-          <w:tcPr>
-            <w:tcW w:type="dxa" w:w="1440"/>
-          </w:tcPr>
-          <w:p>
-            <w:r>
-              <w:rPr>
-                <w:sz w:val="20"/>
-              </w:rPr>
-              <w:t>0.819</w:t>
-            </w:r>
-          </w:p>
-        </w:tc>
-        <w:tc>
-          <w:tcPr>
-            <w:tcW w:type="dxa" w:w="1440"/>
-          </w:tcPr>
-          <w:p>
-            <w:r>
-              <w:rPr>
-                <w:sz w:val="20"/>
-              </w:rPr>
-              <w:t>0.748</w:t>
-            </w:r>
-          </w:p>
-        </w:tc>
-        <w:tc>
-          <w:tcPr>
-            <w:tcW w:type="dxa" w:w="1440"/>
-          </w:tcPr>
-          <w:p>
-            <w:r>
-              <w:rPr>
-                <w:sz w:val="20"/>
-              </w:rPr>
-              <w:t>0.041</w:t>
-            </w:r>
-          </w:p>
-        </w:tc>
-      </w:tr>
-      <w:tr>
-        <w:tc>
-          <w:tcPr>
-            <w:tcW w:type="dxa" w:w="1440"/>
-          </w:tcPr>
-          <w:p>
-            <w:r>
-              <w:rPr>
-                <w:sz w:val="20"/>
-              </w:rPr>
-              <w:t>ENSEMBLE (stacked)</w:t>
-            </w:r>
-          </w:p>
-        </w:tc>
-        <w:tc>
-          <w:tcPr>
-            <w:tcW w:type="dxa" w:w="1440"/>
-          </w:tcPr>
-          <w:p>
-            <w:r>
-              <w:rPr>
-                <w:sz w:val="20"/>
-              </w:rPr>
-              <w:t>0.947</w:t>
-            </w:r>
-          </w:p>
-        </w:tc>
-        <w:tc>
-          <w:tcPr>
-            <w:tcW w:type="dxa" w:w="1440"/>
-          </w:tcPr>
-          <w:p>
-            <w:r>
-              <w:rPr>
-                <w:sz w:val="20"/>
-              </w:rPr>
-              <w:t>0.873</w:t>
-            </w:r>
-          </w:p>
-        </w:tc>
-        <w:tc>
-          <w:tcPr>
-            <w:tcW w:type="dxa" w:w="1440"/>
-          </w:tcPr>
-          <w:p>
-            <w:r>
-              <w:rPr>
-                <w:sz w:val="20"/>
-              </w:rPr>
-              <w:t>0.901</w:t>
-            </w:r>
-          </w:p>
-        </w:tc>
-        <w:tc>
-          <w:tcPr>
-            <w:tcW w:type="dxa" w:w="1440"/>
-          </w:tcPr>
-          <w:p>
-            <w:r>
-              <w:rPr>
-                <w:sz w:val="20"/>
-              </w:rPr>
-              <w:t>0.847</w:t>
-            </w:r>
-          </w:p>
-        </w:tc>
-        <w:tc>
-          <w:tcPr>
-            <w:tcW w:type="dxa" w:w="1440"/>
-          </w:tcPr>
-          <w:p>
-            <w:r>
-              <w:rPr>
-                <w:sz w:val="20"/>
-              </w:rPr>
-              <w:t>0.021</w:t>
+              <w:t>0.0958</w:t>
             </w:r>
           </w:p>
         </w:tc>

</xml_diff>